<commit_message>
arrelgo de errores [ERR-08...
</commit_message>
<xml_diff>
--- a/Fase 2/Evidencias Proyecto/Evidencias de documentación/Cambios Realizados (AUDITORIA CLAUDE).docx
+++ b/Fase 2/Evidencias Proyecto/Evidencias de documentación/Cambios Realizados (AUDITORIA CLAUDE).docx
@@ -26684,6 +26684,484 @@
     </w:p>
     <w:p>
       <w:pPr>
+        <w:rPr>
+          <w:sz w:val="24"/>
+          <w:szCs w:val="24"/>
+        </w:rPr>
+      </w:pPr>
+      <w:r>
+        <w:rPr>
+          <w:b/>
+        </w:rPr>
+        <w:t>Intervención ERR-08, categoría B.2 (18/10/2026): tipos, nombres y nulabilidad del diccionario alineados con init.sql</w:t>
+      </w:r>
+    </w:p>
+    <w:p>
+      <w:pPr>
+        <w:numPr>
+          <w:ilvl w:val="2"/>
+          <w:numId w:val="1"/>
+        </w:numPr>
+        <w:ind w:left="2160" w:hanging="360"/>
+        <w:rPr>
+          <w:sz w:val="24"/>
+          <w:szCs w:val="24"/>
+        </w:rPr>
+      </w:pPr>
+      <w:r>
+        <w:rPr>
+          <w:b/>
+        </w:rPr>
+        <w:t xml:space="preserve">Identificadores: </w:t>
+      </w:r>
+      <w:r>
+        <w:rPr>
+          <w:b w:val="0"/>
+        </w:rPr>
+        <w:t>ERR-08.06, ERR-08.07, ERR-08.08, ERR-08.18, ERR-08.19 y ERR-08.22. Categoría: ERR-08, Esquema y estructura (B).</w:t>
+      </w:r>
+    </w:p>
+    <w:p>
+      <w:pPr>
+        <w:numPr>
+          <w:ilvl w:val="2"/>
+          <w:numId w:val="1"/>
+        </w:numPr>
+        <w:ind w:left="2160" w:hanging="360"/>
+        <w:rPr>
+          <w:sz w:val="24"/>
+          <w:szCs w:val="24"/>
+        </w:rPr>
+      </w:pPr>
+      <w:r>
+        <w:rPr>
+          <w:b/>
+        </w:rPr>
+        <w:t xml:space="preserve">Fecha del cambio: </w:t>
+      </w:r>
+      <w:r>
+        <w:rPr>
+          <w:b w:val="0"/>
+        </w:rPr>
+        <w:t>18/10/2026. Fuente principal de datos: init.sql.</w:t>
+      </w:r>
+    </w:p>
+    <w:p>
+      <w:pPr>
+        <w:numPr>
+          <w:ilvl w:val="2"/>
+          <w:numId w:val="1"/>
+        </w:numPr>
+        <w:ind w:left="2160" w:hanging="360"/>
+        <w:rPr>
+          <w:sz w:val="24"/>
+          <w:szCs w:val="24"/>
+        </w:rPr>
+      </w:pPr>
+      <w:r>
+        <w:rPr>
+          <w:b/>
+        </w:rPr>
+        <w:t xml:space="preserve">Problema original: </w:t>
+      </w:r>
+      <w:r>
+        <w:rPr>
+          <w:b w:val="0"/>
+        </w:rPr>
+        <w:t>06: tipos de MySQL (nvarchar, integer (4)). 07: USUARIO.contra_usuario varchar(50). 08: columnas PIN_ID, suscripcion_ID, msj_personalizado_ID y prioridad_ID como NOT NULL. 18: NOTIFICACION_MOVIL.fecha_envio como date. 19: VENTA.fecha_venta como date. 22: BITACORA_SISTEMA.acción_realizada como text con tilde y fecha_accion como date.</w:t>
+      </w:r>
+    </w:p>
+    <w:p>
+      <w:pPr>
+        <w:numPr>
+          <w:ilvl w:val="2"/>
+          <w:numId w:val="1"/>
+        </w:numPr>
+        <w:ind w:left="2160" w:hanging="360"/>
+        <w:rPr>
+          <w:sz w:val="24"/>
+          <w:szCs w:val="24"/>
+        </w:rPr>
+      </w:pPr>
+      <w:r>
+        <w:rPr>
+          <w:b/>
+        </w:rPr>
+        <w:t xml:space="preserve">Causa raíz: </w:t>
+      </w:r>
+      <w:r>
+        <w:rPr>
+          <w:b w:val="0"/>
+        </w:rPr>
+        <w:t>El diccionario (4.1 BDD con tipos de datos.xlsx) no se actualizó después de los cambios registrados en la bitácora (AUDIT-017, AUDIT-179, AUDIT-180, AUDIT-192, AUDIT-193 y AUDIT-196), que sí están en init.sql.</w:t>
+      </w:r>
+    </w:p>
+    <w:p>
+      <w:pPr>
+        <w:numPr>
+          <w:ilvl w:val="2"/>
+          <w:numId w:val="1"/>
+        </w:numPr>
+        <w:ind w:left="2160" w:hanging="360"/>
+        <w:rPr>
+          <w:sz w:val="24"/>
+          <w:szCs w:val="24"/>
+        </w:rPr>
+      </w:pPr>
+      <w:r>
+        <w:rPr>
+          <w:b/>
+        </w:rPr>
+        <w:t xml:space="preserve">Archivos modificados: </w:t>
+      </w:r>
+      <w:r>
+        <w:rPr>
+          <w:b w:val="0"/>
+        </w:rPr>
+        <w:t>4.1 BDD con tipos de datos.xlsx, 12 celdas: USUARIO (B9, C11 a C14, R7), CONTACTO (B8), NOTIFICACIÓN (B9), VENTA (B11) y AUDITORIA (A7, B7, B8). Matriz de verificación cruzada (filas 116 a 132). datos_agrupados_trazable.docx (resaltado verde de 08.07, 08.08, 08.19 y 08.22).</w:t>
+      </w:r>
+    </w:p>
+    <w:p>
+      <w:pPr>
+        <w:numPr>
+          <w:ilvl w:val="2"/>
+          <w:numId w:val="1"/>
+        </w:numPr>
+        <w:ind w:left="2160" w:hanging="360"/>
+        <w:rPr>
+          <w:sz w:val="24"/>
+          <w:szCs w:val="24"/>
+        </w:rPr>
+      </w:pPr>
+      <w:r>
+        <w:rPr>
+          <w:b/>
+        </w:rPr>
+        <w:t xml:space="preserve">Solución implementada: </w:t>
+      </w:r>
+      <w:r>
+        <w:rPr>
+          <w:b w:val="0"/>
+        </w:rPr>
+        <w:t>Se cambiaron los tipos, nombres y nulabilidad de esas celdas para que coincidan con init.sql. No se modificó init.sql, ni el código, ni la base de datos.</w:t>
+      </w:r>
+    </w:p>
+    <w:p>
+      <w:pPr>
+        <w:numPr>
+          <w:ilvl w:val="2"/>
+          <w:numId w:val="1"/>
+        </w:numPr>
+        <w:ind w:left="2160" w:hanging="360"/>
+        <w:rPr>
+          <w:sz w:val="24"/>
+          <w:szCs w:val="24"/>
+        </w:rPr>
+      </w:pPr>
+      <w:r>
+        <w:rPr>
+          <w:b/>
+        </w:rPr>
+        <w:t xml:space="preserve">Resultado de las pruebas: </w:t>
+      </w:r>
+      <w:r>
+        <w:rPr>
+          <w:b w:val="0"/>
+        </w:rPr>
+        <w:t>Comparación celda a celda del diccionario contra init.sql (L41, L43 a L46, L98 a L105, L116 a L122 y L221 a L224) y contra la entidad bitacora.entity.ts. Comparación del libro con su copia original: solo cambiaron las 12 celdas previstas, sin cambios de estilo ni de combinaciones. No se levantó la base de datos (sin prueba de arranque).</w:t>
+      </w:r>
+    </w:p>
+    <w:p>
+      <w:pPr>
+        <w:numPr>
+          <w:ilvl w:val="2"/>
+          <w:numId w:val="1"/>
+        </w:numPr>
+        <w:ind w:left="2160" w:hanging="360"/>
+        <w:rPr>
+          <w:sz w:val="24"/>
+          <w:szCs w:val="24"/>
+        </w:rPr>
+      </w:pPr>
+      <w:r>
+        <w:rPr>
+          <w:b/>
+        </w:rPr>
+        <w:t xml:space="preserve">Estado final: </w:t>
+      </w:r>
+      <w:r>
+        <w:rPr>
+          <w:b w:val="0"/>
+        </w:rPr>
+        <w:t>ERR-08.07, ERR-08.08, ERR-08.19 y ERR-08.22: RESUELTO (verificado). ERR-08.06 y ERR-08.18: PARCIAL.</w:t>
+      </w:r>
+    </w:p>
+    <w:p>
+      <w:pPr>
+        <w:numPr>
+          <w:ilvl w:val="2"/>
+          <w:numId w:val="1"/>
+        </w:numPr>
+        <w:ind w:left="2160" w:hanging="360"/>
+        <w:rPr>
+          <w:sz w:val="24"/>
+          <w:szCs w:val="24"/>
+        </w:rPr>
+      </w:pPr>
+      <w:r>
+        <w:rPr>
+          <w:b/>
+        </w:rPr>
+        <w:t xml:space="preserve">Observaciones y limitaciones pendientes: </w:t>
+      </w:r>
+      <w:r>
+        <w:rPr>
+          <w:b w:val="0"/>
+        </w:rPr>
+        <w:t>(1) 08.06: la hoja PROPUESTA DE MEJORA aún tiene nvarchar e int (PK/FK); está fuera de alcance según AUDIT-197. (2) 08.18: AUDIT-192 indica timestamptz, pero init.sql tiene TIMESTAMP; requiere decisión. (3) Diferencias detectadas y no registradas en ningún ERR-08, sin modificar: CONTACTO.fecha_contacto y RESPUESTA_CONTACTO.fecha_respuesta; NOTIFICACIÓN.titulo_mensaje y cuerpo_mensaje; MENSAJE_CONTACTO.mensaje; otros text frente a varchar(n) de init.sql.</w:t>
+      </w:r>
+    </w:p>
+    <w:p>
+      <w:pPr>
+        <w:rPr>
+          <w:sz w:val="24"/>
+          <w:szCs w:val="24"/>
+        </w:rPr>
+      </w:pPr>
+      <w:r>
+        <w:rPr>
+          <w:b/>
+        </w:rPr>
+        <w:t>Actualización ERR-08, categoría B.2 (18/10/2026): decisión TIMESTAMP y alineación de todas las hojas activas con init.sql</w:t>
+      </w:r>
+    </w:p>
+    <w:p>
+      <w:pPr>
+        <w:numPr>
+          <w:ilvl w:val="2"/>
+          <w:numId w:val="1"/>
+        </w:numPr>
+        <w:ind w:left="2160" w:hanging="360"/>
+        <w:rPr>
+          <w:sz w:val="24"/>
+          <w:szCs w:val="24"/>
+        </w:rPr>
+      </w:pPr>
+      <w:r>
+        <w:rPr>
+          <w:b/>
+        </w:rPr>
+        <w:t xml:space="preserve">Identificadores: </w:t>
+      </w:r>
+      <w:r>
+        <w:rPr>
+          <w:b w:val="0"/>
+        </w:rPr>
+        <w:t>ERR-08.18 (cierre) y ERR-08.06 (sigue PARCIAL). Los 16 cambios adicionales no tienen fila propia en la matriz.</w:t>
+      </w:r>
+    </w:p>
+    <w:p>
+      <w:pPr>
+        <w:numPr>
+          <w:ilvl w:val="2"/>
+          <w:numId w:val="1"/>
+        </w:numPr>
+        <w:ind w:left="2160" w:hanging="360"/>
+        <w:rPr>
+          <w:sz w:val="24"/>
+          <w:szCs w:val="24"/>
+        </w:rPr>
+      </w:pPr>
+      <w:r>
+        <w:rPr>
+          <w:b/>
+        </w:rPr>
+        <w:t xml:space="preserve">Decisión: </w:t>
+      </w:r>
+      <w:r>
+        <w:rPr>
+          <w:b w:val="0"/>
+        </w:rPr>
+        <w:t>se usa TIMESTAMP para NOTIFICACION_MOVIL.fecha_envio, según init.sql (L81). AUDIT-192 mencionaba timestamptz; no se aplicó y el registro histórico no se modifica.</w:t>
+      </w:r>
+    </w:p>
+    <w:p>
+      <w:pPr>
+        <w:numPr>
+          <w:ilvl w:val="2"/>
+          <w:numId w:val="1"/>
+        </w:numPr>
+        <w:ind w:left="2160" w:hanging="360"/>
+        <w:rPr>
+          <w:sz w:val="24"/>
+          <w:szCs w:val="24"/>
+        </w:rPr>
+      </w:pPr>
+      <w:r>
+        <w:rPr>
+          <w:b/>
+        </w:rPr>
+        <w:t xml:space="preserve">Problema adicional encontrado: </w:t>
+      </w:r>
+      <w:r>
+        <w:rPr>
+          <w:b w:val="0"/>
+        </w:rPr>
+        <w:t>comparación de todas las hojas activas contra init.sql. 10 columnas en text en lugar de VARCHAR(n), 2 VARCHAR con longitud distinta, y 4 fechas en timestamptz o date en lugar de TIMESTAMP.</w:t>
+      </w:r>
+    </w:p>
+    <w:p>
+      <w:pPr>
+        <w:numPr>
+          <w:ilvl w:val="2"/>
+          <w:numId w:val="1"/>
+        </w:numPr>
+        <w:ind w:left="2160" w:hanging="360"/>
+        <w:rPr>
+          <w:sz w:val="24"/>
+          <w:szCs w:val="24"/>
+        </w:rPr>
+      </w:pPr>
+      <w:r>
+        <w:rPr>
+          <w:b/>
+        </w:rPr>
+        <w:t xml:space="preserve">Archivos modificados: </w:t>
+      </w:r>
+      <w:r>
+        <w:rPr>
+          <w:b w:val="0"/>
+        </w:rPr>
+        <w:t>4.1 BDD con tipos de datos.xlsx: hojas APLICACIÓN (B7, F7), NOTIFICACIÓN (B7, B8, B9), PLANES (B7, B11), SOPORTE (B7, B8, B9, F7, N7), CONTACTO (B7, B9, B10, N7, N8), USUARIO (B9, R7) y VENTA (B11), AUDITORIA (B7, B8) en mayúsculas. datos_agrupados_trazable.docx: verde en ERR-08.18.</w:t>
+      </w:r>
+    </w:p>
+    <w:p>
+      <w:pPr>
+        <w:numPr>
+          <w:ilvl w:val="2"/>
+          <w:numId w:val="1"/>
+        </w:numPr>
+        <w:ind w:left="2160" w:hanging="360"/>
+        <w:rPr>
+          <w:sz w:val="24"/>
+          <w:szCs w:val="24"/>
+        </w:rPr>
+      </w:pPr>
+      <w:r>
+        <w:rPr>
+          <w:b/>
+        </w:rPr>
+        <w:t xml:space="preserve">Solución implementada: </w:t>
+      </w:r>
+      <w:r>
+        <w:rPr>
+          <w:b w:val="0"/>
+        </w:rPr>
+        <w:t>VARCHAR(n) y TIMESTAMP según init.sql. Las celdas de la intervención anterior se escribieron en mayúsculas para mantener un solo formato. No se modificó init.sql, ni el código, ni la base de datos.</w:t>
+      </w:r>
+    </w:p>
+    <w:p>
+      <w:pPr>
+        <w:numPr>
+          <w:ilvl w:val="2"/>
+          <w:numId w:val="1"/>
+        </w:numPr>
+        <w:ind w:left="2160" w:hanging="360"/>
+        <w:rPr>
+          <w:sz w:val="24"/>
+          <w:szCs w:val="24"/>
+        </w:rPr>
+      </w:pPr>
+      <w:r>
+        <w:rPr>
+          <w:b/>
+        </w:rPr>
+        <w:t xml:space="preserve">Resultado de las pruebas: </w:t>
+      </w:r>
+      <w:r>
+        <w:rPr>
+          <w:b w:val="0"/>
+        </w:rPr>
+        <w:t>comparación automática de las hojas activas contra init.sql: 0 discrepancias de tipo o nulabilidad (la hoja PROPUESTA DE MEJORA se excluye). Diferencia del libro contra la copia original: 28 celdas, todas previstas.</w:t>
+      </w:r>
+    </w:p>
+    <w:p>
+      <w:pPr>
+        <w:numPr>
+          <w:ilvl w:val="2"/>
+          <w:numId w:val="1"/>
+        </w:numPr>
+        <w:ind w:left="2160" w:hanging="360"/>
+        <w:rPr>
+          <w:sz w:val="24"/>
+          <w:szCs w:val="24"/>
+        </w:rPr>
+      </w:pPr>
+      <w:r>
+        <w:rPr>
+          <w:b/>
+        </w:rPr>
+        <w:t xml:space="preserve">Estado final: </w:t>
+      </w:r>
+      <w:r>
+        <w:rPr>
+          <w:b w:val="0"/>
+        </w:rPr>
+        <w:t>ERR-08.18: RESUELTO (verificado). ERR-08.06: PARCIAL, pendiente solo la hoja PROPUESTA DE MEJORA (fuera de alcance, AUDIT-197).</w:t>
+      </w:r>
+    </w:p>
+    <w:p>
+      <w:pPr>
+        <w:numPr>
+          <w:ilvl w:val="2"/>
+          <w:numId w:val="1"/>
+        </w:numPr>
+        <w:ind w:left="2160" w:hanging="360"/>
+        <w:rPr>
+          <w:sz w:val="24"/>
+          <w:szCs w:val="24"/>
+        </w:rPr>
+      </w:pPr>
+      <w:r>
+        <w:rPr>
+          <w:b/>
+        </w:rPr>
+        <w:t xml:space="preserve">Matriz actualizada (18/10/2026): </w:t>
+      </w:r>
+      <w:r>
+        <w:rPr>
+          <w:b w:val="0"/>
+        </w:rPr>
+        <w:t>las filas de ERR-08.06 (nota actualizada, estado PARCIAL) y ERR-08.18 (Verificado, verde) se guardaron tras cerrar Excel. Verificado al releer el archivo.</w:t>
+      </w:r>
+    </w:p>
+    <w:p>
+      <w:pPr>
+        <w:numPr>
+          <w:ilvl w:val="2"/>
+          <w:numId w:val="1"/>
+        </w:numPr>
+        <w:ind w:left="2160" w:hanging="360"/>
+        <w:rPr>
+          <w:sz w:val="24"/>
+          <w:szCs w:val="24"/>
+        </w:rPr>
+      </w:pPr>
+      <w:r>
+        <w:rPr>
+          <w:b/>
+        </w:rPr>
+        <w:t xml:space="preserve">Observaciones y limitaciones pendientes: </w:t>
+      </w:r>
+      <w:r>
+        <w:rPr>
+          <w:b w:val="0"/>
+        </w:rPr>
+        <w:t>(1) Columnas que no existen en init.sql y siguen en el diccionario: DETALLE_ALERTA.antecedente_medico_ID y SOPORTE.estado_ticket_ID; tablas ANTECEDENTE_MEDICO y otras de la migración pendiente (AUDIT-P02). (2) No se levantó la base de datos. (3) Las 16 correcciones adicionales no tienen ID propio: decidir si se registran como ERR-08.26 y siguientes.</w:t>
+      </w:r>
+    </w:p>
+    <w:p>
+      <w:pPr>
         <w:ind w:left="0" w:firstLine="0"/>
         <w:rPr>
           <w:sz w:val="24"/>
@@ -26694,6 +27172,2416 @@
         <w:rPr>
           <w:rtl w:val="0"/>
         </w:rPr>
+      </w:r>
+    </w:p>
+    <w:p>
+      <w:pPr>
+        <w:rPr>
+          <w:sz w:val="24"/>
+          <w:szCs w:val="24"/>
+        </w:rPr>
+      </w:pPr>
+      <w:r>
+        <w:rPr>
+          <w:b/>
+        </w:rPr>
+        <w:t>Intervención ERR-08, categoría E / B (18/10/2026): registro corregido (ERR-08.05 y ERR-08.20)</w:t>
+      </w:r>
+    </w:p>
+    <w:p>
+      <w:pPr>
+        <w:numPr>
+          <w:ilvl w:val="2"/>
+          <w:numId w:val="1"/>
+        </w:numPr>
+        <w:ind w:left="2160" w:hanging="360"/>
+        <w:rPr>
+          <w:sz w:val="24"/>
+          <w:szCs w:val="24"/>
+        </w:rPr>
+      </w:pPr>
+      <w:r>
+        <w:rPr>
+          <w:b/>
+        </w:rPr>
+        <w:t xml:space="preserve">Identificadores: </w:t>
+      </w:r>
+      <w:r>
+        <w:rPr>
+          <w:b w:val="0"/>
+        </w:rPr>
+        <w:t>ERR-08.05 y ERR-08.20. Categoría: ERR-08, Esquema y estructura (B.2) y Migración (E).</w:t>
+      </w:r>
+    </w:p>
+    <w:p>
+      <w:pPr>
+        <w:numPr>
+          <w:ilvl w:val="2"/>
+          <w:numId w:val="1"/>
+        </w:numPr>
+        <w:ind w:left="2160" w:hanging="360"/>
+        <w:rPr>
+          <w:sz w:val="24"/>
+          <w:szCs w:val="24"/>
+        </w:rPr>
+      </w:pPr>
+      <w:r>
+        <w:rPr>
+          <w:b/>
+        </w:rPr>
+        <w:t xml:space="preserve">Fecha del cambio: </w:t>
+      </w:r>
+      <w:r>
+        <w:rPr>
+          <w:b w:val="0"/>
+        </w:rPr>
+        <w:t>18/10/2026. Decisión del equipo: solo corregir el registro, sin modificar el esquema.</w:t>
+      </w:r>
+    </w:p>
+    <w:p>
+      <w:pPr>
+        <w:numPr>
+          <w:ilvl w:val="2"/>
+          <w:numId w:val="1"/>
+        </w:numPr>
+        <w:ind w:left="2160" w:hanging="360"/>
+        <w:rPr>
+          <w:sz w:val="24"/>
+          <w:szCs w:val="24"/>
+        </w:rPr>
+      </w:pPr>
+      <w:r>
+        <w:rPr>
+          <w:b/>
+        </w:rPr>
+        <w:t xml:space="preserve">Problema original: </w:t>
+      </w:r>
+      <w:r>
+        <w:rPr>
+          <w:b w:val="0"/>
+        </w:rPr>
+        <w:t>datos_agrupados_trazable marcaba ERR-08.05 y ERR-08.20 como resueltos (AUDIT-014 y AUDIT-194), pero PLAN todavía tiene total_venta y fecha_venta.</w:t>
+      </w:r>
+    </w:p>
+    <w:p>
+      <w:pPr>
+        <w:numPr>
+          <w:ilvl w:val="2"/>
+          <w:numId w:val="1"/>
+        </w:numPr>
+        <w:ind w:left="2160" w:hanging="360"/>
+        <w:rPr>
+          <w:sz w:val="24"/>
+          <w:szCs w:val="24"/>
+        </w:rPr>
+      </w:pPr>
+      <w:r>
+        <w:rPr>
+          <w:b/>
+        </w:rPr>
+        <w:t xml:space="preserve">Causa raíz: </w:t>
+      </w:r>
+      <w:r>
+        <w:rPr>
+          <w:b w:val="0"/>
+        </w:rPr>
+        <w:t>el registro se escribió como resuelto sin verificar el archivo ni init.sql; el cambio no se aplicó.</w:t>
+      </w:r>
+    </w:p>
+    <w:p>
+      <w:pPr>
+        <w:numPr>
+          <w:ilvl w:val="2"/>
+          <w:numId w:val="1"/>
+        </w:numPr>
+        <w:ind w:left="2160" w:hanging="360"/>
+        <w:rPr>
+          <w:sz w:val="24"/>
+          <w:szCs w:val="24"/>
+        </w:rPr>
+      </w:pPr>
+      <w:r>
+        <w:rPr>
+          <w:b/>
+        </w:rPr>
+        <w:t xml:space="preserve">Archivos modificados: </w:t>
+      </w:r>
+      <w:r>
+        <w:rPr>
+          <w:b w:val="0"/>
+        </w:rPr>
+        <w:t>datos_agrupados_trazable.docx: texto de los registros de trazabilidad de ERR-08.05 y ERR-08.20 (de "Resolución documentada" a "Pendiente de resolución"). Sin cambios en init.sql ni en el diccionario.</w:t>
+      </w:r>
+    </w:p>
+    <w:p>
+      <w:pPr>
+        <w:numPr>
+          <w:ilvl w:val="2"/>
+          <w:numId w:val="1"/>
+        </w:numPr>
+        <w:ind w:left="2160" w:hanging="360"/>
+        <w:rPr>
+          <w:sz w:val="24"/>
+          <w:szCs w:val="24"/>
+        </w:rPr>
+      </w:pPr>
+      <w:r>
+        <w:rPr>
+          <w:b/>
+        </w:rPr>
+        <w:t xml:space="preserve">Solución implementada: </w:t>
+      </w:r>
+      <w:r>
+        <w:rPr>
+          <w:b w:val="0"/>
+        </w:rPr>
+        <w:t>corrección del registro. El esquema no se modifica.</w:t>
+      </w:r>
+    </w:p>
+    <w:p>
+      <w:pPr>
+        <w:numPr>
+          <w:ilvl w:val="2"/>
+          <w:numId w:val="1"/>
+        </w:numPr>
+        <w:ind w:left="2160" w:hanging="360"/>
+        <w:rPr>
+          <w:sz w:val="24"/>
+          <w:szCs w:val="24"/>
+        </w:rPr>
+      </w:pPr>
+      <w:r>
+        <w:rPr>
+          <w:b/>
+        </w:rPr>
+        <w:t xml:space="preserve">Resultado de las pruebas: </w:t>
+      </w:r>
+      <w:r>
+        <w:rPr>
+          <w:b w:val="0"/>
+        </w:rPr>
+        <w:t>verificación de init.sql (PLAN L112-113 con total_venta y fecha_venta; PLAN_USUARIO sin FK) y de la hoja PLANES (filas 10-11). No se levantó la BD.</w:t>
+      </w:r>
+    </w:p>
+    <w:p>
+      <w:pPr>
+        <w:numPr>
+          <w:ilvl w:val="2"/>
+          <w:numId w:val="1"/>
+        </w:numPr>
+        <w:ind w:left="2160" w:hanging="360"/>
+        <w:rPr>
+          <w:sz w:val="24"/>
+          <w:szCs w:val="24"/>
+        </w:rPr>
+      </w:pPr>
+      <w:r>
+        <w:rPr>
+          <w:b/>
+        </w:rPr>
+        <w:t xml:space="preserve">Estado final: </w:t>
+      </w:r>
+      <w:r>
+        <w:rPr>
+          <w:b w:val="0"/>
+        </w:rPr>
+        <w:t>ERR-08.05 y ERR-08.20: PENDIENTE (no resuelto). Pendiente de decisión sobre quitar las columnas de PLAN.</w:t>
+      </w:r>
+    </w:p>
+    <w:p>
+      <w:pPr>
+        <w:rPr>
+          <w:sz w:val="24"/>
+          <w:szCs w:val="24"/>
+        </w:rPr>
+      </w:pPr>
+      <w:r>
+        <w:rPr>
+          <w:b/>
+        </w:rPr>
+        <w:t>Intervención ERR-08, categoría B.1 (18/10/2026): tipos MySQL convertidos a PostgreSQL en ALERTAS y PROPUESTA DE MEJORA (ERR-08.06)</w:t>
+      </w:r>
+    </w:p>
+    <w:p>
+      <w:pPr>
+        <w:numPr>
+          <w:ilvl w:val="2"/>
+          <w:numId w:val="1"/>
+        </w:numPr>
+        <w:ind w:left="2160" w:hanging="360"/>
+        <w:rPr>
+          <w:sz w:val="24"/>
+          <w:szCs w:val="24"/>
+        </w:rPr>
+      </w:pPr>
+      <w:r>
+        <w:rPr>
+          <w:b/>
+        </w:rPr>
+        <w:t xml:space="preserve">Identificadores: </w:t>
+      </w:r>
+      <w:r>
+        <w:rPr>
+          <w:b w:val="0"/>
+        </w:rPr>
+        <w:t>ERR-08.06. Categoría: ERR-08, Esquema y estructura (B.1).</w:t>
+      </w:r>
+    </w:p>
+    <w:p>
+      <w:pPr>
+        <w:numPr>
+          <w:ilvl w:val="2"/>
+          <w:numId w:val="1"/>
+        </w:numPr>
+        <w:ind w:left="2160" w:hanging="360"/>
+        <w:rPr>
+          <w:sz w:val="24"/>
+          <w:szCs w:val="24"/>
+        </w:rPr>
+      </w:pPr>
+      <w:r>
+        <w:rPr>
+          <w:b/>
+        </w:rPr>
+        <w:t xml:space="preserve">Fecha del cambio: </w:t>
+      </w:r>
+      <w:r>
+        <w:rPr>
+          <w:b w:val="0"/>
+        </w:rPr>
+        <w:t>18/10/2026.</w:t>
+      </w:r>
+    </w:p>
+    <w:p>
+      <w:pPr>
+        <w:numPr>
+          <w:ilvl w:val="2"/>
+          <w:numId w:val="1"/>
+        </w:numPr>
+        <w:ind w:left="2160" w:hanging="360"/>
+        <w:rPr>
+          <w:sz w:val="24"/>
+          <w:szCs w:val="24"/>
+        </w:rPr>
+      </w:pPr>
+      <w:r>
+        <w:rPr>
+          <w:b/>
+        </w:rPr>
+        <w:t xml:space="preserve">Problema original: </w:t>
+      </w:r>
+      <w:r>
+        <w:rPr>
+          <w:b w:val="0"/>
+        </w:rPr>
+        <w:t>ALERTAS F7 (UBICACION_ALERTA.ubicacion) figuraba como "text" (init.sql: VARCHAR(150)). La hoja PROPUESTA DE MEJORA conservaba nvarchar e int (PK/FK).</w:t>
+      </w:r>
+    </w:p>
+    <w:p>
+      <w:pPr>
+        <w:numPr>
+          <w:ilvl w:val="2"/>
+          <w:numId w:val="1"/>
+        </w:numPr>
+        <w:ind w:left="2160" w:hanging="360"/>
+        <w:rPr>
+          <w:sz w:val="24"/>
+          <w:szCs w:val="24"/>
+        </w:rPr>
+      </w:pPr>
+      <w:r>
+        <w:rPr>
+          <w:b/>
+        </w:rPr>
+        <w:t xml:space="preserve">Causa raíz: </w:t>
+      </w:r>
+      <w:r>
+        <w:rPr>
+          <w:b w:val="0"/>
+        </w:rPr>
+        <w:t>el diccionario se actualizó solo en las hojas revisadas; ALERTAS no se incluyó en la comparación del 18/10 (P855), por lo que la afirmación de cero discrepancias era incorrecta.</w:t>
+      </w:r>
+    </w:p>
+    <w:p>
+      <w:pPr>
+        <w:numPr>
+          <w:ilvl w:val="2"/>
+          <w:numId w:val="1"/>
+        </w:numPr>
+        <w:ind w:left="2160" w:hanging="360"/>
+        <w:rPr>
+          <w:sz w:val="24"/>
+          <w:szCs w:val="24"/>
+        </w:rPr>
+      </w:pPr>
+      <w:r>
+        <w:rPr>
+          <w:b/>
+        </w:rPr>
+        <w:t xml:space="preserve">Archivos modificados: </w:t>
+      </w:r>
+      <w:r>
+        <w:rPr>
+          <w:b w:val="0"/>
+        </w:rPr>
+        <w:t>4.1 BDD con tipos de datos.xlsx: ALERTAS F7 (text a VARCHAR(150)); PROPUESTA DE MEJORA, 29 celdas (nvarchar(n) a VARCHAR(n); int a integer). Matriz de verificación cruzada (fila 116, estado Verificado; fila 115, nota). datos_agrupados_trazable.docx: resaltado verde del registro ERR-08.06.</w:t>
+      </w:r>
+    </w:p>
+    <w:p>
+      <w:pPr>
+        <w:numPr>
+          <w:ilvl w:val="2"/>
+          <w:numId w:val="1"/>
+        </w:numPr>
+        <w:ind w:left="2160" w:hanging="360"/>
+        <w:rPr>
+          <w:sz w:val="24"/>
+          <w:szCs w:val="24"/>
+        </w:rPr>
+      </w:pPr>
+      <w:r>
+        <w:rPr>
+          <w:b/>
+        </w:rPr>
+        <w:t xml:space="preserve">Solución implementada: </w:t>
+      </w:r>
+      <w:r>
+        <w:rPr>
+          <w:b w:val="0"/>
+        </w:rPr>
+        <w:t>conversión de tipos al estilo PostgreSQL del resto del diccionario. No se modificó init.sql, el código ni la BD.</w:t>
+      </w:r>
+    </w:p>
+    <w:p>
+      <w:pPr>
+        <w:numPr>
+          <w:ilvl w:val="2"/>
+          <w:numId w:val="1"/>
+        </w:numPr>
+        <w:ind w:left="2160" w:hanging="360"/>
+        <w:rPr>
+          <w:sz w:val="24"/>
+          <w:szCs w:val="24"/>
+        </w:rPr>
+      </w:pPr>
+      <w:r>
+        <w:rPr>
+          <w:b/>
+        </w:rPr>
+        <w:t xml:space="preserve">Resultado de las pruebas: </w:t>
+      </w:r>
+      <w:r>
+        <w:rPr>
+          <w:b w:val="0"/>
+        </w:rPr>
+        <w:t>comparación celda a celda contra el respaldo: 30 celdas cambiadas (todas previstas); libro sin residuos nvarchar, int ni text en las hojas; 7 comentarios, validaciones y celdas combinadas conservados.</w:t>
+      </w:r>
+    </w:p>
+    <w:p>
+      <w:pPr>
+        <w:numPr>
+          <w:ilvl w:val="2"/>
+          <w:numId w:val="1"/>
+        </w:numPr>
+        <w:ind w:left="2160" w:hanging="360"/>
+        <w:rPr>
+          <w:sz w:val="24"/>
+          <w:szCs w:val="24"/>
+        </w:rPr>
+      </w:pPr>
+      <w:r>
+        <w:rPr>
+          <w:b/>
+        </w:rPr>
+        <w:t xml:space="preserve">Estado final: </w:t>
+      </w:r>
+      <w:r>
+        <w:rPr>
+          <w:b w:val="0"/>
+        </w:rPr>
+        <w:t>ERR-08.06: RESUELTO (verificado por revisión de tipos; sin prueba en BD).</w:t>
+      </w:r>
+    </w:p>
+    <w:p>
+      <w:pPr>
+        <w:numPr>
+          <w:ilvl w:val="2"/>
+          <w:numId w:val="1"/>
+        </w:numPr>
+        <w:ind w:left="2160" w:hanging="360"/>
+        <w:rPr>
+          <w:sz w:val="24"/>
+          <w:szCs w:val="24"/>
+        </w:rPr>
+      </w:pPr>
+      <w:r>
+        <w:rPr>
+          <w:b/>
+        </w:rPr>
+        <w:t xml:space="preserve">Observaciones: </w:t>
+      </w:r>
+      <w:r>
+        <w:rPr>
+          <w:b w:val="0"/>
+        </w:rPr>
+        <w:t>PROPUESTA DE MEJORA es una hoja fuera de alcance (AUDIT-197). Se convirtió por decisión del equipo. Pendiente en ERR-08.25 la migración real de init.sql.</w:t>
+      </w:r>
+    </w:p>
+    <w:p>
+      <w:pPr>
+        <w:rPr>
+          <w:sz w:val="24"/>
+          <w:szCs w:val="24"/>
+        </w:rPr>
+      </w:pPr>
+      <w:r>
+        <w:rPr>
+          <w:b/>
+        </w:rPr>
+        <w:t>Intervención ERR-08, categoría B.1 (18/10/2026): catálogo cerrado de ROL documentado (ERR-08.09)</w:t>
+      </w:r>
+    </w:p>
+    <w:p>
+      <w:pPr>
+        <w:numPr>
+          <w:ilvl w:val="2"/>
+          <w:numId w:val="1"/>
+        </w:numPr>
+        <w:ind w:left="2160" w:hanging="360"/>
+        <w:rPr>
+          <w:sz w:val="24"/>
+          <w:szCs w:val="24"/>
+        </w:rPr>
+      </w:pPr>
+      <w:r>
+        <w:rPr>
+          <w:b/>
+        </w:rPr>
+        <w:t xml:space="preserve">Identificadores: </w:t>
+      </w:r>
+      <w:r>
+        <w:rPr>
+          <w:b w:val="0"/>
+        </w:rPr>
+        <w:t>ERR-08.09. Categoría: ERR-08, Esquema y estructura (B.1).</w:t>
+      </w:r>
+    </w:p>
+    <w:p>
+      <w:pPr>
+        <w:numPr>
+          <w:ilvl w:val="2"/>
+          <w:numId w:val="1"/>
+        </w:numPr>
+        <w:ind w:left="2160" w:hanging="360"/>
+        <w:rPr>
+          <w:sz w:val="24"/>
+          <w:szCs w:val="24"/>
+        </w:rPr>
+      </w:pPr>
+      <w:r>
+        <w:rPr>
+          <w:b/>
+        </w:rPr>
+        <w:t xml:space="preserve">Fecha del cambio: </w:t>
+      </w:r>
+      <w:r>
+        <w:rPr>
+          <w:b w:val="0"/>
+        </w:rPr>
+        <w:t>18/10/2026.</w:t>
+      </w:r>
+    </w:p>
+    <w:p>
+      <w:pPr>
+        <w:numPr>
+          <w:ilvl w:val="2"/>
+          <w:numId w:val="1"/>
+        </w:numPr>
+        <w:ind w:left="2160" w:hanging="360"/>
+        <w:rPr>
+          <w:sz w:val="24"/>
+          <w:szCs w:val="24"/>
+        </w:rPr>
+      </w:pPr>
+      <w:r>
+        <w:rPr>
+          <w:b/>
+        </w:rPr>
+        <w:t xml:space="preserve">Problema original: </w:t>
+      </w:r>
+      <w:r>
+        <w:rPr>
+          <w:b w:val="0"/>
+        </w:rPr>
+        <w:t>la tabla ROL no tenía catálogo documentado en el diccionario (AUDIT-181).</w:t>
+      </w:r>
+    </w:p>
+    <w:p>
+      <w:pPr>
+        <w:numPr>
+          <w:ilvl w:val="2"/>
+          <w:numId w:val="1"/>
+        </w:numPr>
+        <w:ind w:left="2160" w:hanging="360"/>
+        <w:rPr>
+          <w:sz w:val="24"/>
+          <w:szCs w:val="24"/>
+        </w:rPr>
+      </w:pPr>
+      <w:r>
+        <w:rPr>
+          <w:b/>
+        </w:rPr>
+        <w:t xml:space="preserve">Causa raíz: </w:t>
+      </w:r>
+      <w:r>
+        <w:rPr>
+          <w:b w:val="0"/>
+        </w:rPr>
+        <w:t>el diccionario no recogía los valores de rol que el código ya usa. La lista de la matriz (ADMIN, SOPORTE, empleado, principal, apadrinado) no coincide con el código: el enum tiene tres roles y principal/apadrinado son tipos de cuenta (usuario_principal_ID), no roles.</w:t>
+      </w:r>
+    </w:p>
+    <w:p>
+      <w:pPr>
+        <w:numPr>
+          <w:ilvl w:val="2"/>
+          <w:numId w:val="1"/>
+        </w:numPr>
+        <w:ind w:left="2160" w:hanging="360"/>
+        <w:rPr>
+          <w:sz w:val="24"/>
+          <w:szCs w:val="24"/>
+        </w:rPr>
+      </w:pPr>
+      <w:r>
+        <w:rPr>
+          <w:b/>
+        </w:rPr>
+        <w:t xml:space="preserve">Archivos modificados: </w:t>
+      </w:r>
+      <w:r>
+        <w:rPr>
+          <w:b w:val="0"/>
+        </w:rPr>
+        <w:t>4.1 BDD con tipos de datos.xlsx: hoja USUARIO, rango E10:F14 (catálogo). Matriz de verificación cruzada (fila 119). datos_agrupados_trazable.docx: resaltado verde del registro ERR-08.09 y trazabilidad.</w:t>
+      </w:r>
+    </w:p>
+    <w:p>
+      <w:pPr>
+        <w:numPr>
+          <w:ilvl w:val="2"/>
+          <w:numId w:val="1"/>
+        </w:numPr>
+        <w:ind w:left="2160" w:hanging="360"/>
+        <w:rPr>
+          <w:sz w:val="24"/>
+          <w:szCs w:val="24"/>
+        </w:rPr>
+      </w:pPr>
+      <w:r>
+        <w:rPr>
+          <w:b/>
+        </w:rPr>
+        <w:t xml:space="preserve">Solución implementada: </w:t>
+      </w:r>
+      <w:r>
+        <w:rPr>
+          <w:b w:val="0"/>
+        </w:rPr>
+        <w:t>catálogo cerrado documentado con los valores de roles.decorator.ts (1 ADMINISTRADOR, 2 SOPORTE, 3 USUARIO). No se modificó init.sql ni el código.</w:t>
+      </w:r>
+    </w:p>
+    <w:p>
+      <w:pPr>
+        <w:numPr>
+          <w:ilvl w:val="2"/>
+          <w:numId w:val="1"/>
+        </w:numPr>
+        <w:ind w:left="2160" w:hanging="360"/>
+        <w:rPr>
+          <w:sz w:val="24"/>
+          <w:szCs w:val="24"/>
+        </w:rPr>
+      </w:pPr>
+      <w:r>
+        <w:rPr>
+          <w:b/>
+        </w:rPr>
+        <w:t xml:space="preserve">Resultado de las pruebas: </w:t>
+      </w:r>
+      <w:r>
+        <w:rPr>
+          <w:b w:val="0"/>
+        </w:rPr>
+        <w:t>comparación de los valores con roles.decorator.ts. No se levantó la BD ni se probó el CHECK, que no existe en init.sql.</w:t>
+      </w:r>
+    </w:p>
+    <w:p>
+      <w:pPr>
+        <w:numPr>
+          <w:ilvl w:val="2"/>
+          <w:numId w:val="1"/>
+        </w:numPr>
+        <w:ind w:left="2160" w:hanging="360"/>
+        <w:rPr>
+          <w:sz w:val="24"/>
+          <w:szCs w:val="24"/>
+        </w:rPr>
+      </w:pPr>
+      <w:r>
+        <w:rPr>
+          <w:b/>
+        </w:rPr>
+        <w:t xml:space="preserve">Estado final: </w:t>
+      </w:r>
+      <w:r>
+        <w:rPr>
+          <w:b w:val="0"/>
+        </w:rPr>
+        <w:t>ERR-08.09: RESUELTO (documentación verificada contra el código).</w:t>
+      </w:r>
+    </w:p>
+    <w:p>
+      <w:pPr>
+        <w:numPr>
+          <w:ilvl w:val="2"/>
+          <w:numId w:val="1"/>
+        </w:numPr>
+        <w:ind w:left="2160" w:hanging="360"/>
+        <w:rPr>
+          <w:sz w:val="24"/>
+          <w:szCs w:val="24"/>
+        </w:rPr>
+      </w:pPr>
+      <w:r>
+        <w:rPr>
+          <w:b/>
+        </w:rPr>
+        <w:t xml:space="preserve">Observaciones: </w:t>
+      </w:r>
+      <w:r>
+        <w:rPr>
+          <w:b w:val="0"/>
+        </w:rPr>
+        <w:t>init.sql no restringe nombre_rol con CHECK; si el equipo lo quiere, es un cambio de esquema pendiente de autorización. La lista original de la matriz debe revisarse con el equipo.</w:t>
+      </w:r>
+    </w:p>
+    <w:p>
+      <w:pPr>
+        <w:rPr>
+          <w:sz w:val="24"/>
+          <w:szCs w:val="24"/>
+        </w:rPr>
+      </w:pPr>
+      <w:r>
+        <w:rPr>
+          <w:b/>
+        </w:rPr>
+        <w:t>Revisión ERR-08.10, categoría B.1 (18/10/2026): pendiente (sin cambios en archivos)</w:t>
+      </w:r>
+    </w:p>
+    <w:p>
+      <w:pPr>
+        <w:numPr>
+          <w:ilvl w:val="2"/>
+          <w:numId w:val="1"/>
+        </w:numPr>
+        <w:ind w:left="2160" w:hanging="360"/>
+        <w:rPr>
+          <w:sz w:val="24"/>
+          <w:szCs w:val="24"/>
+        </w:rPr>
+      </w:pPr>
+      <w:r>
+        <w:rPr>
+          <w:b/>
+        </w:rPr>
+        <w:t xml:space="preserve">Identificadores: </w:t>
+      </w:r>
+      <w:r>
+        <w:rPr>
+          <w:b w:val="0"/>
+        </w:rPr>
+        <w:t>ERR-08.10. Categoría: ERR-08, Esquema y estructura (B.1).</w:t>
+      </w:r>
+    </w:p>
+    <w:p>
+      <w:pPr>
+        <w:numPr>
+          <w:ilvl w:val="2"/>
+          <w:numId w:val="1"/>
+        </w:numPr>
+        <w:ind w:left="2160" w:hanging="360"/>
+        <w:rPr>
+          <w:sz w:val="24"/>
+          <w:szCs w:val="24"/>
+        </w:rPr>
+      </w:pPr>
+      <w:r>
+        <w:rPr>
+          <w:b/>
+        </w:rPr>
+        <w:t xml:space="preserve">Decisión: </w:t>
+      </w:r>
+      <w:r>
+        <w:rPr>
+          <w:b w:val="0"/>
+        </w:rPr>
+        <w:t>dejar pendiente. El equipo debe definir la lista de tipos de emergencia.</w:t>
+      </w:r>
+    </w:p>
+    <w:p>
+      <w:pPr>
+        <w:numPr>
+          <w:ilvl w:val="2"/>
+          <w:numId w:val="1"/>
+        </w:numPr>
+        <w:ind w:left="2160" w:hanging="360"/>
+        <w:rPr>
+          <w:sz w:val="24"/>
+          <w:szCs w:val="24"/>
+        </w:rPr>
+      </w:pPr>
+      <w:r>
+        <w:rPr>
+          <w:b/>
+        </w:rPr>
+        <w:t xml:space="preserve">Motivo: </w:t>
+      </w:r>
+      <w:r>
+        <w:rPr>
+          <w:b w:val="0"/>
+        </w:rPr>
+        <w:t>el código no define valores de PRIORIDAD; los niveles Crítica/Alta/Media de los documentos son prioridades de HU, no de emergencias.</w:t>
+      </w:r>
+    </w:p>
+    <w:p>
+      <w:pPr>
+        <w:numPr>
+          <w:ilvl w:val="2"/>
+          <w:numId w:val="1"/>
+        </w:numPr>
+        <w:ind w:left="2160" w:hanging="360"/>
+        <w:rPr>
+          <w:sz w:val="24"/>
+          <w:szCs w:val="24"/>
+        </w:rPr>
+      </w:pPr>
+      <w:r>
+        <w:rPr>
+          <w:b/>
+        </w:rPr>
+        <w:t xml:space="preserve">Archivos modificados: </w:t>
+      </w:r>
+      <w:r>
+        <w:rPr>
+          <w:b w:val="0"/>
+        </w:rPr>
+        <w:t>datos_agrupados_trazable.docx: registro de ERR-08.10 corregido de "documentada" a "pendiente de resolución". Matriz (fila 120, nota).</w:t>
+      </w:r>
+    </w:p>
+    <w:p>
+      <w:pPr>
+        <w:numPr>
+          <w:ilvl w:val="2"/>
+          <w:numId w:val="1"/>
+        </w:numPr>
+        <w:ind w:left="2160" w:hanging="360"/>
+        <w:rPr>
+          <w:sz w:val="24"/>
+          <w:szCs w:val="24"/>
+        </w:rPr>
+      </w:pPr>
+      <w:r>
+        <w:rPr>
+          <w:b/>
+        </w:rPr>
+        <w:t xml:space="preserve">Estado final: </w:t>
+      </w:r>
+      <w:r>
+        <w:rPr>
+          <w:b w:val="0"/>
+        </w:rPr>
+        <w:t>ERR-08.10: PENDIENTE.</w:t>
+      </w:r>
+    </w:p>
+    <w:p>
+      <w:pPr>
+        <w:rPr>
+          <w:sz w:val="24"/>
+          <w:szCs w:val="24"/>
+        </w:rPr>
+      </w:pPr>
+      <w:r>
+        <w:rPr>
+          <w:b/>
+        </w:rPr>
+        <w:t>Revisión ERR-08.11, categoría B.1 (18/10/2026): parcial, sin cambios en archivos</w:t>
+      </w:r>
+    </w:p>
+    <w:p>
+      <w:pPr>
+        <w:numPr>
+          <w:ilvl w:val="2"/>
+          <w:numId w:val="1"/>
+        </w:numPr>
+        <w:ind w:left="2160" w:hanging="360"/>
+        <w:rPr>
+          <w:sz w:val="24"/>
+          <w:szCs w:val="24"/>
+        </w:rPr>
+      </w:pPr>
+      <w:r>
+        <w:rPr>
+          <w:b/>
+        </w:rPr>
+        <w:t xml:space="preserve">Identificadores: </w:t>
+      </w:r>
+      <w:r>
+        <w:rPr>
+          <w:b w:val="0"/>
+        </w:rPr>
+        <w:t>ERR-08.11. Categoría: ERR-08, Esquema y estructura (B.1), con implicaciones de seguridad (G).</w:t>
+      </w:r>
+    </w:p>
+    <w:p>
+      <w:pPr>
+        <w:numPr>
+          <w:ilvl w:val="2"/>
+          <w:numId w:val="1"/>
+        </w:numPr>
+        <w:ind w:left="2160" w:hanging="360"/>
+        <w:rPr>
+          <w:sz w:val="24"/>
+          <w:szCs w:val="24"/>
+        </w:rPr>
+      </w:pPr>
+      <w:r>
+        <w:rPr>
+          <w:b/>
+        </w:rPr>
+        <w:t xml:space="preserve">Decisión: </w:t>
+      </w:r>
+      <w:r>
+        <w:rPr>
+          <w:b w:val="0"/>
+        </w:rPr>
+        <w:t>solo corregir el registro. El equipo decidirá después si agrega pin_hash e intentos_fallidos al diccionario o al esquema.</w:t>
+      </w:r>
+    </w:p>
+    <w:p>
+      <w:pPr>
+        <w:numPr>
+          <w:ilvl w:val="2"/>
+          <w:numId w:val="1"/>
+        </w:numPr>
+        <w:ind w:left="2160" w:hanging="360"/>
+        <w:rPr>
+          <w:sz w:val="24"/>
+          <w:szCs w:val="24"/>
+        </w:rPr>
+      </w:pPr>
+      <w:r>
+        <w:rPr>
+          <w:b/>
+        </w:rPr>
+        <w:t xml:space="preserve">Archivos modificados: </w:t>
+      </w:r>
+      <w:r>
+        <w:rPr>
+          <w:b w:val="0"/>
+        </w:rPr>
+        <w:t>datos_agrupados_trazable.docx: registro de ERR-08.11 de "documentada" a "parcial". Matriz (fila 121: estado Parcial, nota y evidencia).</w:t>
+      </w:r>
+    </w:p>
+    <w:p>
+      <w:pPr>
+        <w:numPr>
+          <w:ilvl w:val="2"/>
+          <w:numId w:val="1"/>
+        </w:numPr>
+        <w:ind w:left="2160" w:hanging="360"/>
+        <w:rPr>
+          <w:sz w:val="24"/>
+          <w:szCs w:val="24"/>
+        </w:rPr>
+      </w:pPr>
+      <w:r>
+        <w:rPr>
+          <w:b/>
+        </w:rPr>
+        <w:t xml:space="preserve">Estado final: </w:t>
+      </w:r>
+      <w:r>
+        <w:rPr>
+          <w:b w:val="0"/>
+        </w:rPr>
+        <w:t>ERR-08.11: PARCIAL. El tipo PIN VARCHAR(4) está aplicado; faltan pin_hash e intentos_fallidos (AUDIT-P02).</w:t>
+      </w:r>
+    </w:p>
+    <w:p>
+      <w:pPr>
+        <w:rPr>
+          <w:sz w:val="24"/>
+          <w:szCs w:val="24"/>
+        </w:rPr>
+      </w:pPr>
+      <w:r>
+        <w:rPr>
+          <w:b/>
+        </w:rPr>
+        <w:t>Intervención ERR-08.12, categoría B.1 (18/10/2026): num_emergencia en E.164 y campos de contacto (parcial)</w:t>
+      </w:r>
+    </w:p>
+    <w:p>
+      <w:pPr>
+        <w:numPr>
+          <w:ilvl w:val="2"/>
+          <w:numId w:val="1"/>
+        </w:numPr>
+        <w:ind w:left="2160" w:hanging="360"/>
+        <w:rPr>
+          <w:sz w:val="24"/>
+          <w:szCs w:val="24"/>
+        </w:rPr>
+      </w:pPr>
+      <w:r>
+        <w:rPr>
+          <w:b/>
+        </w:rPr>
+        <w:t xml:space="preserve">Identificadores: </w:t>
+      </w:r>
+      <w:r>
+        <w:rPr>
+          <w:b w:val="0"/>
+        </w:rPr>
+        <w:t>ERR-08.12. Categoría: ERR-08, Esquema y estructura (B.1).</w:t>
+      </w:r>
+    </w:p>
+    <w:p>
+      <w:pPr>
+        <w:numPr>
+          <w:ilvl w:val="2"/>
+          <w:numId w:val="1"/>
+        </w:numPr>
+        <w:ind w:left="2160" w:hanging="360"/>
+        <w:rPr>
+          <w:sz w:val="24"/>
+          <w:szCs w:val="24"/>
+        </w:rPr>
+      </w:pPr>
+      <w:r>
+        <w:rPr>
+          <w:b/>
+        </w:rPr>
+        <w:t xml:space="preserve">Fecha del cambio: </w:t>
+      </w:r>
+      <w:r>
+        <w:rPr>
+          <w:b w:val="0"/>
+        </w:rPr>
+        <w:t>18/10/2026.</w:t>
+      </w:r>
+    </w:p>
+    <w:p>
+      <w:pPr>
+        <w:numPr>
+          <w:ilvl w:val="2"/>
+          <w:numId w:val="1"/>
+        </w:numPr>
+        <w:ind w:left="2160" w:hanging="360"/>
+        <w:rPr>
+          <w:sz w:val="24"/>
+          <w:szCs w:val="24"/>
+        </w:rPr>
+      </w:pPr>
+      <w:r>
+        <w:rPr>
+          <w:b/>
+        </w:rPr>
+        <w:t xml:space="preserve">Problema original: </w:t>
+      </w:r>
+      <w:r>
+        <w:rPr>
+          <w:b w:val="0"/>
+        </w:rPr>
+        <w:t>num_emergencia VARCHAR(9) no admite el formato +56 (E.164); faltaban nombre y parentesco del contacto (AUDIT-184).</w:t>
+      </w:r>
+    </w:p>
+    <w:p>
+      <w:pPr>
+        <w:numPr>
+          <w:ilvl w:val="2"/>
+          <w:numId w:val="1"/>
+        </w:numPr>
+        <w:ind w:left="2160" w:hanging="360"/>
+        <w:rPr>
+          <w:sz w:val="24"/>
+          <w:szCs w:val="24"/>
+        </w:rPr>
+      </w:pPr>
+      <w:r>
+        <w:rPr>
+          <w:b/>
+        </w:rPr>
+        <w:t xml:space="preserve">Archivos modificados: </w:t>
+      </w:r>
+      <w:r>
+        <w:rPr>
+          <w:b w:val="0"/>
+        </w:rPr>
+        <w:t>4.1 BDD con tipos de datos.xlsx: hoja USUARIO, J8 (VARCHAR(16)) y filas nuevas I9:K10 (nombre_contacto, parentesco; tipo VARCHAR(n) por definir). Matriz (fila 122). datos_agrupados_trazable.docx: registro de ERR-08.12 de "documentada" a "parcial".</w:t>
+      </w:r>
+    </w:p>
+    <w:p>
+      <w:pPr>
+        <w:numPr>
+          <w:ilvl w:val="2"/>
+          <w:numId w:val="1"/>
+        </w:numPr>
+        <w:ind w:left="2160" w:hanging="360"/>
+        <w:rPr>
+          <w:sz w:val="24"/>
+          <w:szCs w:val="24"/>
+        </w:rPr>
+      </w:pPr>
+      <w:r>
+        <w:rPr>
+          <w:b/>
+        </w:rPr>
+        <w:t xml:space="preserve">Solución implementada: </w:t>
+      </w:r>
+      <w:r>
+        <w:rPr>
+          <w:b w:val="0"/>
+        </w:rPr>
+        <w:t>cambio solo en el diccionario, según decisión del equipo. init.sql no se modificó.</w:t>
+      </w:r>
+    </w:p>
+    <w:p>
+      <w:pPr>
+        <w:numPr>
+          <w:ilvl w:val="2"/>
+          <w:numId w:val="1"/>
+        </w:numPr>
+        <w:ind w:left="2160" w:hanging="360"/>
+        <w:rPr>
+          <w:sz w:val="24"/>
+          <w:szCs w:val="24"/>
+        </w:rPr>
+      </w:pPr>
+      <w:r>
+        <w:rPr>
+          <w:b/>
+        </w:rPr>
+        <w:t xml:space="preserve">Resultado de las pruebas: </w:t>
+      </w:r>
+      <w:r>
+        <w:rPr>
+          <w:b w:val="0"/>
+        </w:rPr>
+        <w:t>verificación de celdas en el diccionario. init.sql L59 sigue VARCHAR(9): divergencia pendiente de migración. No se levantó la BD.</w:t>
+      </w:r>
+    </w:p>
+    <w:p>
+      <w:pPr>
+        <w:numPr>
+          <w:ilvl w:val="2"/>
+          <w:numId w:val="1"/>
+        </w:numPr>
+        <w:ind w:left="2160" w:hanging="360"/>
+        <w:rPr>
+          <w:sz w:val="24"/>
+          <w:szCs w:val="24"/>
+        </w:rPr>
+      </w:pPr>
+      <w:r>
+        <w:rPr>
+          <w:b/>
+        </w:rPr>
+        <w:t xml:space="preserve">Estado final: </w:t>
+      </w:r>
+      <w:r>
+        <w:rPr>
+          <w:b w:val="0"/>
+        </w:rPr>
+        <w:t>ERR-08.12: PARCIAL. Pendiente: definir longitud de nombre y parentesco, y migrar init.sql (AUDIT-P02).</w:t>
+      </w:r>
+    </w:p>
+    <w:p>
+      <w:pPr>
+        <w:rPr>
+          <w:sz w:val="24"/>
+          <w:szCs w:val="24"/>
+        </w:rPr>
+      </w:pPr>
+      <w:r>
+        <w:rPr>
+          <w:b/>
+        </w:rPr>
+        <w:t>Revisión ERR-08.13, categoría E (18/10/2026): pendiente (sin cambios en archivos)</w:t>
+      </w:r>
+    </w:p>
+    <w:p>
+      <w:pPr>
+        <w:numPr>
+          <w:ilvl w:val="2"/>
+          <w:numId w:val="1"/>
+        </w:numPr>
+        <w:ind w:left="2160" w:hanging="360"/>
+        <w:rPr>
+          <w:sz w:val="24"/>
+          <w:szCs w:val="24"/>
+        </w:rPr>
+      </w:pPr>
+      <w:r>
+        <w:rPr>
+          <w:b/>
+        </w:rPr>
+        <w:t xml:space="preserve">Identificadores: </w:t>
+      </w:r>
+      <w:r>
+        <w:rPr>
+          <w:b w:val="0"/>
+        </w:rPr>
+        <w:t>ERR-08.13. Categoría: ERR-08, Migraciones y sincronización (E), con esquema (B).</w:t>
+      </w:r>
+    </w:p>
+    <w:p>
+      <w:pPr>
+        <w:numPr>
+          <w:ilvl w:val="2"/>
+          <w:numId w:val="1"/>
+        </w:numPr>
+        <w:ind w:left="2160" w:hanging="360"/>
+        <w:rPr>
+          <w:sz w:val="24"/>
+          <w:szCs w:val="24"/>
+        </w:rPr>
+      </w:pPr>
+      <w:r>
+        <w:rPr>
+          <w:b/>
+        </w:rPr>
+        <w:t xml:space="preserve">Decisión: </w:t>
+      </w:r>
+      <w:r>
+        <w:rPr>
+          <w:b w:val="0"/>
+        </w:rPr>
+        <w:t>solo corregir el registro. El equipo decidirá si ALERTA se documenta en el diccionario o en init.sql.</w:t>
+      </w:r>
+    </w:p>
+    <w:p>
+      <w:pPr>
+        <w:numPr>
+          <w:ilvl w:val="2"/>
+          <w:numId w:val="1"/>
+        </w:numPr>
+        <w:ind w:left="2160" w:hanging="360"/>
+        <w:rPr>
+          <w:sz w:val="24"/>
+          <w:szCs w:val="24"/>
+        </w:rPr>
+      </w:pPr>
+      <w:r>
+        <w:rPr>
+          <w:b/>
+        </w:rPr>
+        <w:t xml:space="preserve">Archivos modificados: </w:t>
+      </w:r>
+      <w:r>
+        <w:rPr>
+          <w:b w:val="0"/>
+        </w:rPr>
+        <w:t>datos_agrupados_trazable.docx: registro de ERR-08.13 de "documentada" a "pendiente de resolución". Matriz (fila 123, nota).</w:t>
+      </w:r>
+    </w:p>
+    <w:p>
+      <w:pPr>
+        <w:numPr>
+          <w:ilvl w:val="2"/>
+          <w:numId w:val="1"/>
+        </w:numPr>
+        <w:ind w:left="2160" w:hanging="360"/>
+        <w:rPr>
+          <w:sz w:val="24"/>
+          <w:szCs w:val="24"/>
+        </w:rPr>
+      </w:pPr>
+      <w:r>
+        <w:rPr>
+          <w:b/>
+        </w:rPr>
+        <w:t xml:space="preserve">Estado final: </w:t>
+      </w:r>
+      <w:r>
+        <w:rPr>
+          <w:b w:val="0"/>
+        </w:rPr>
+        <w:t>ERR-08.13: PENDIENTE.</w:t>
+      </w:r>
+    </w:p>
+    <w:p>
+      <w:pPr>
+        <w:rPr>
+          <w:sz w:val="24"/>
+          <w:szCs w:val="24"/>
+        </w:rPr>
+      </w:pPr>
+      <w:r>
+        <w:rPr>
+          <w:b/>
+        </w:rPr>
+        <w:t>Intervención ERR-08.14, categoría E / B.1 (18/10/2026): campos de ubicación añadidos al diccionario (parcial)</w:t>
+      </w:r>
+    </w:p>
+    <w:p>
+      <w:pPr>
+        <w:numPr>
+          <w:ilvl w:val="2"/>
+          <w:numId w:val="1"/>
+        </w:numPr>
+        <w:ind w:left="2160" w:hanging="360"/>
+        <w:rPr>
+          <w:sz w:val="24"/>
+          <w:szCs w:val="24"/>
+        </w:rPr>
+      </w:pPr>
+      <w:r>
+        <w:rPr>
+          <w:b/>
+        </w:rPr>
+        <w:t xml:space="preserve">Identificadores: </w:t>
+      </w:r>
+      <w:r>
+        <w:rPr>
+          <w:b w:val="0"/>
+        </w:rPr>
+        <w:t>ERR-08.14. Categoría: ERR-08, Esquema (B.1) y migración pendiente (E).</w:t>
+      </w:r>
+    </w:p>
+    <w:p>
+      <w:pPr>
+        <w:numPr>
+          <w:ilvl w:val="2"/>
+          <w:numId w:val="1"/>
+        </w:numPr>
+        <w:ind w:left="2160" w:hanging="360"/>
+        <w:rPr>
+          <w:sz w:val="24"/>
+          <w:szCs w:val="24"/>
+        </w:rPr>
+      </w:pPr>
+      <w:r>
+        <w:rPr>
+          <w:b/>
+        </w:rPr>
+        <w:t xml:space="preserve">Problema original: </w:t>
+      </w:r>
+      <w:r>
+        <w:rPr>
+          <w:b w:val="0"/>
+        </w:rPr>
+        <w:t>UBICACION_ALERTA solo tenía ubicacion; faltaban latitud, longitud, precisión, fuente y hora de captura (AUDIT-187).</w:t>
+      </w:r>
+    </w:p>
+    <w:p>
+      <w:pPr>
+        <w:numPr>
+          <w:ilvl w:val="2"/>
+          <w:numId w:val="1"/>
+        </w:numPr>
+        <w:ind w:left="2160" w:hanging="360"/>
+        <w:rPr>
+          <w:sz w:val="24"/>
+          <w:szCs w:val="24"/>
+        </w:rPr>
+      </w:pPr>
+      <w:r>
+        <w:rPr>
+          <w:b/>
+        </w:rPr>
+        <w:t xml:space="preserve">Archivos modificados: </w:t>
+      </w:r>
+      <w:r>
+        <w:rPr>
+          <w:b w:val="0"/>
+        </w:rPr>
+        <w:t>4.1 BDD con tipos de datos.xlsx: hoja ALERTAS, bloque nuevo U4:W10 (latitud, longitud, precision, fuente, hora_captura). Matriz (fila 124). datos_agrupados_trazable.docx: registro de ERR-08.14 de "documentada" a "parcial".</w:t>
+      </w:r>
+    </w:p>
+    <w:p>
+      <w:pPr>
+        <w:numPr>
+          <w:ilvl w:val="2"/>
+          <w:numId w:val="1"/>
+        </w:numPr>
+        <w:ind w:left="2160" w:hanging="360"/>
+        <w:rPr>
+          <w:sz w:val="24"/>
+          <w:szCs w:val="24"/>
+        </w:rPr>
+      </w:pPr>
+      <w:r>
+        <w:rPr>
+          <w:b/>
+        </w:rPr>
+        <w:t xml:space="preserve">Solución implementada: </w:t>
+      </w:r>
+      <w:r>
+        <w:rPr>
+          <w:b w:val="0"/>
+        </w:rPr>
+        <w:t>campos añadidos al diccionario. Los tipos son propuestas (marcadas "propuesto") y la nulabilidad está por definir. init.sql no se modificó.</w:t>
+      </w:r>
+    </w:p>
+    <w:p>
+      <w:pPr>
+        <w:numPr>
+          <w:ilvl w:val="2"/>
+          <w:numId w:val="1"/>
+        </w:numPr>
+        <w:ind w:left="2160" w:hanging="360"/>
+        <w:rPr>
+          <w:sz w:val="24"/>
+          <w:szCs w:val="24"/>
+        </w:rPr>
+      </w:pPr>
+      <w:r>
+        <w:rPr>
+          <w:b/>
+        </w:rPr>
+        <w:t xml:space="preserve">Resultado de las pruebas: </w:t>
+      </w:r>
+      <w:r>
+        <w:rPr>
+          <w:b w:val="0"/>
+        </w:rPr>
+        <w:t>verificación de celdas en el diccionario. init.sql L135-138 sigue sin esos campos.</w:t>
+      </w:r>
+    </w:p>
+    <w:p>
+      <w:pPr>
+        <w:numPr>
+          <w:ilvl w:val="2"/>
+          <w:numId w:val="1"/>
+        </w:numPr>
+        <w:ind w:left="2160" w:hanging="360"/>
+        <w:rPr>
+          <w:sz w:val="24"/>
+          <w:szCs w:val="24"/>
+        </w:rPr>
+      </w:pPr>
+      <w:r>
+        <w:rPr>
+          <w:b/>
+        </w:rPr>
+        <w:t xml:space="preserve">Estado final: </w:t>
+      </w:r>
+      <w:r>
+        <w:rPr>
+          <w:b w:val="0"/>
+        </w:rPr>
+        <w:t>ERR-08.14: PARCIAL. Pendiente: confirmar tipos y nulabilidad, y migrar init.sql (AUDIT-P02).</w:t>
+      </w:r>
+    </w:p>
+    <w:p>
+      <w:pPr>
+        <w:rPr>
+          <w:sz w:val="24"/>
+          <w:szCs w:val="24"/>
+        </w:rPr>
+      </w:pPr>
+      <w:r>
+        <w:rPr>
+          <w:b/>
+        </w:rPr>
+        <w:t>Revisión ERR-08.15, categoría E (18/10/2026): pendiente (sin cambios en archivos)</w:t>
+      </w:r>
+    </w:p>
+    <w:p>
+      <w:pPr>
+        <w:numPr>
+          <w:ilvl w:val="2"/>
+          <w:numId w:val="1"/>
+        </w:numPr>
+        <w:ind w:left="2160" w:hanging="360"/>
+        <w:rPr>
+          <w:sz w:val="24"/>
+          <w:szCs w:val="24"/>
+        </w:rPr>
+      </w:pPr>
+      <w:r>
+        <w:rPr>
+          <w:b/>
+        </w:rPr>
+        <w:t xml:space="preserve">Identificadores: </w:t>
+      </w:r>
+      <w:r>
+        <w:rPr>
+          <w:b w:val="0"/>
+        </w:rPr>
+        <w:t>ERR-08.15. Categoría: ERR-08, Migraciones y sincronización (E), con esquema (B).</w:t>
+      </w:r>
+    </w:p>
+    <w:p>
+      <w:pPr>
+        <w:numPr>
+          <w:ilvl w:val="2"/>
+          <w:numId w:val="1"/>
+        </w:numPr>
+        <w:ind w:left="2160" w:hanging="360"/>
+        <w:rPr>
+          <w:sz w:val="24"/>
+          <w:szCs w:val="24"/>
+        </w:rPr>
+      </w:pPr>
+      <w:r>
+        <w:rPr>
+          <w:b/>
+        </w:rPr>
+        <w:t xml:space="preserve">Decisión: </w:t>
+      </w:r>
+      <w:r>
+        <w:rPr>
+          <w:b w:val="0"/>
+        </w:rPr>
+        <w:t>solo corregir el registro.</w:t>
+      </w:r>
+    </w:p>
+    <w:p>
+      <w:pPr>
+        <w:numPr>
+          <w:ilvl w:val="2"/>
+          <w:numId w:val="1"/>
+        </w:numPr>
+        <w:ind w:left="2160" w:hanging="360"/>
+        <w:rPr>
+          <w:sz w:val="24"/>
+          <w:szCs w:val="24"/>
+        </w:rPr>
+      </w:pPr>
+      <w:r>
+        <w:rPr>
+          <w:b/>
+        </w:rPr>
+        <w:t xml:space="preserve">Archivos modificados: </w:t>
+      </w:r>
+      <w:r>
+        <w:rPr>
+          <w:b w:val="0"/>
+        </w:rPr>
+        <w:t>datos_agrupados_trazable.docx: registro de ERR-08.15 de "documentada" a "pendiente de resolución". Matriz (fila 125, nota).</w:t>
+      </w:r>
+    </w:p>
+    <w:p>
+      <w:pPr>
+        <w:numPr>
+          <w:ilvl w:val="2"/>
+          <w:numId w:val="1"/>
+        </w:numPr>
+        <w:ind w:left="2160" w:hanging="360"/>
+        <w:rPr>
+          <w:sz w:val="24"/>
+          <w:szCs w:val="24"/>
+        </w:rPr>
+      </w:pPr>
+      <w:r>
+        <w:rPr>
+          <w:b/>
+        </w:rPr>
+        <w:t xml:space="preserve">Estado final: </w:t>
+      </w:r>
+      <w:r>
+        <w:rPr>
+          <w:b w:val="0"/>
+        </w:rPr>
+        <w:t>ERR-08.15: PENDIENTE.</w:t>
+      </w:r>
+    </w:p>
+    <w:p>
+      <w:pPr>
+        <w:rPr>
+          <w:sz w:val="24"/>
+          <w:szCs w:val="24"/>
+        </w:rPr>
+      </w:pPr>
+      <w:r>
+        <w:rPr>
+          <w:b/>
+        </w:rPr>
+        <w:t>Revisión ERR-08.16, categoría E (18/10/2026): pendiente (sin cambios en archivos)</w:t>
+      </w:r>
+    </w:p>
+    <w:p>
+      <w:pPr>
+        <w:numPr>
+          <w:ilvl w:val="2"/>
+          <w:numId w:val="1"/>
+        </w:numPr>
+        <w:ind w:left="2160" w:hanging="360"/>
+        <w:rPr>
+          <w:sz w:val="24"/>
+          <w:szCs w:val="24"/>
+        </w:rPr>
+      </w:pPr>
+      <w:r>
+        <w:rPr>
+          <w:b/>
+        </w:rPr>
+        <w:t xml:space="preserve">Identificadores: </w:t>
+      </w:r>
+      <w:r>
+        <w:rPr>
+          <w:b w:val="0"/>
+        </w:rPr>
+        <w:t>ERR-08.16. Categoría: ERR-08, Migraciones y sincronización (E), con esquema (B).</w:t>
+      </w:r>
+    </w:p>
+    <w:p>
+      <w:pPr>
+        <w:numPr>
+          <w:ilvl w:val="2"/>
+          <w:numId w:val="1"/>
+        </w:numPr>
+        <w:ind w:left="2160" w:hanging="360"/>
+        <w:rPr>
+          <w:sz w:val="24"/>
+          <w:szCs w:val="24"/>
+        </w:rPr>
+      </w:pPr>
+      <w:r>
+        <w:rPr>
+          <w:b/>
+        </w:rPr>
+        <w:t xml:space="preserve">Decisión: </w:t>
+      </w:r>
+      <w:r>
+        <w:rPr>
+          <w:b w:val="0"/>
+        </w:rPr>
+        <w:t>solo corregir el registro.</w:t>
+      </w:r>
+    </w:p>
+    <w:p>
+      <w:pPr>
+        <w:numPr>
+          <w:ilvl w:val="2"/>
+          <w:numId w:val="1"/>
+        </w:numPr>
+        <w:ind w:left="2160" w:hanging="360"/>
+        <w:rPr>
+          <w:sz w:val="24"/>
+          <w:szCs w:val="24"/>
+        </w:rPr>
+      </w:pPr>
+      <w:r>
+        <w:rPr>
+          <w:b/>
+        </w:rPr>
+        <w:t xml:space="preserve">Archivos modificados: </w:t>
+      </w:r>
+      <w:r>
+        <w:rPr>
+          <w:b w:val="0"/>
+        </w:rPr>
+        <w:t>datos_agrupados_trazable.docx: registro de ERR-08.16 de "documentada" a "pendiente de resolución". Matriz (fila 126, nota).</w:t>
+      </w:r>
+    </w:p>
+    <w:p>
+      <w:pPr>
+        <w:numPr>
+          <w:ilvl w:val="2"/>
+          <w:numId w:val="1"/>
+        </w:numPr>
+        <w:ind w:left="2160" w:hanging="360"/>
+        <w:rPr>
+          <w:sz w:val="24"/>
+          <w:szCs w:val="24"/>
+        </w:rPr>
+      </w:pPr>
+      <w:r>
+        <w:rPr>
+          <w:b/>
+        </w:rPr>
+        <w:t xml:space="preserve">Estado final: </w:t>
+      </w:r>
+      <w:r>
+        <w:rPr>
+          <w:b w:val="0"/>
+        </w:rPr>
+        <w:t>ERR-08.16: PENDIENTE.</w:t>
+      </w:r>
+    </w:p>
+    <w:p>
+      <w:pPr>
+        <w:rPr>
+          <w:sz w:val="24"/>
+          <w:szCs w:val="24"/>
+        </w:rPr>
+      </w:pPr>
+      <w:r>
+        <w:rPr>
+          <w:b/>
+        </w:rPr>
+        <w:t>Revisión ERR-08.17, categoría E (18/10/2026): pendiente (sin cambios en archivos)</w:t>
+      </w:r>
+    </w:p>
+    <w:p>
+      <w:pPr>
+        <w:numPr>
+          <w:ilvl w:val="2"/>
+          <w:numId w:val="1"/>
+        </w:numPr>
+        <w:ind w:left="2160" w:hanging="360"/>
+        <w:rPr>
+          <w:sz w:val="24"/>
+          <w:szCs w:val="24"/>
+        </w:rPr>
+      </w:pPr>
+      <w:r>
+        <w:rPr>
+          <w:b/>
+        </w:rPr>
+        <w:t xml:space="preserve">Identificadores: </w:t>
+      </w:r>
+      <w:r>
+        <w:rPr>
+          <w:b w:val="0"/>
+        </w:rPr>
+        <w:t>ERR-08.17. Categoría: ERR-08, Migraciones y sincronización (E), con esquema (B).</w:t>
+      </w:r>
+    </w:p>
+    <w:p>
+      <w:pPr>
+        <w:numPr>
+          <w:ilvl w:val="2"/>
+          <w:numId w:val="1"/>
+        </w:numPr>
+        <w:ind w:left="2160" w:hanging="360"/>
+        <w:rPr>
+          <w:sz w:val="24"/>
+          <w:szCs w:val="24"/>
+        </w:rPr>
+      </w:pPr>
+      <w:r>
+        <w:rPr>
+          <w:b/>
+        </w:rPr>
+        <w:t xml:space="preserve">Decisión: </w:t>
+      </w:r>
+      <w:r>
+        <w:rPr>
+          <w:b w:val="0"/>
+        </w:rPr>
+        <w:t>solo corregir el registro.</w:t>
+      </w:r>
+    </w:p>
+    <w:p>
+      <w:pPr>
+        <w:numPr>
+          <w:ilvl w:val="2"/>
+          <w:numId w:val="1"/>
+        </w:numPr>
+        <w:ind w:left="2160" w:hanging="360"/>
+        <w:rPr>
+          <w:sz w:val="24"/>
+          <w:szCs w:val="24"/>
+        </w:rPr>
+      </w:pPr>
+      <w:r>
+        <w:rPr>
+          <w:b/>
+        </w:rPr>
+        <w:t xml:space="preserve">Observación: </w:t>
+      </w:r>
+      <w:r>
+        <w:rPr>
+          <w:b w:val="0"/>
+        </w:rPr>
+        <w:t>el párrafo de Cambios Pendientes (A-01) que dice que ENVIO_ALERTA "ya quedó listo" no está respaldado: la tabla no aparece en las hojas activas ni en init.sql. No se edita el texto original; esta nota lo corrige.</w:t>
+      </w:r>
+    </w:p>
+    <w:p>
+      <w:pPr>
+        <w:numPr>
+          <w:ilvl w:val="2"/>
+          <w:numId w:val="1"/>
+        </w:numPr>
+        <w:ind w:left="2160" w:hanging="360"/>
+        <w:rPr>
+          <w:sz w:val="24"/>
+          <w:szCs w:val="24"/>
+        </w:rPr>
+      </w:pPr>
+      <w:r>
+        <w:rPr>
+          <w:b/>
+        </w:rPr>
+        <w:t xml:space="preserve">Archivos modificados: </w:t>
+      </w:r>
+      <w:r>
+        <w:rPr>
+          <w:b w:val="0"/>
+        </w:rPr>
+        <w:t>datos_agrupados_trazable.docx: registro de ERR-08.17 de "documentada" a "pendiente de resolución". Matriz (fila 127, nota).</w:t>
+      </w:r>
+    </w:p>
+    <w:p>
+      <w:pPr>
+        <w:numPr>
+          <w:ilvl w:val="2"/>
+          <w:numId w:val="1"/>
+        </w:numPr>
+        <w:ind w:left="2160" w:hanging="360"/>
+        <w:rPr>
+          <w:sz w:val="24"/>
+          <w:szCs w:val="24"/>
+        </w:rPr>
+      </w:pPr>
+      <w:r>
+        <w:rPr>
+          <w:b/>
+        </w:rPr>
+        <w:t xml:space="preserve">Estado final: </w:t>
+      </w:r>
+      <w:r>
+        <w:rPr>
+          <w:b w:val="0"/>
+        </w:rPr>
+        <w:t>ERR-08.17: PENDIENTE.</w:t>
+      </w:r>
+    </w:p>
+    <w:p>
+      <w:pPr>
+        <w:rPr>
+          <w:sz w:val="24"/>
+          <w:szCs w:val="24"/>
+        </w:rPr>
+      </w:pPr>
+      <w:r>
+        <w:rPr>
+          <w:b/>
+        </w:rPr>
+        <w:t>Revisión ERR-08.21, categoría B.1 (18/10/2026): parcial (sin cambios en archivos)</w:t>
+      </w:r>
+    </w:p>
+    <w:p>
+      <w:pPr>
+        <w:numPr>
+          <w:ilvl w:val="2"/>
+          <w:numId w:val="1"/>
+        </w:numPr>
+        <w:ind w:left="2160" w:hanging="360"/>
+        <w:rPr>
+          <w:sz w:val="24"/>
+          <w:szCs w:val="24"/>
+        </w:rPr>
+      </w:pPr>
+      <w:r>
+        <w:rPr>
+          <w:b/>
+        </w:rPr>
+        <w:t xml:space="preserve">Identificadores: </w:t>
+      </w:r>
+      <w:r>
+        <w:rPr>
+          <w:b w:val="0"/>
+        </w:rPr>
+        <w:t>ERR-08.21. Categoría: ERR-08, Esquema y estructura (B.1).</w:t>
+      </w:r>
+    </w:p>
+    <w:p>
+      <w:pPr>
+        <w:numPr>
+          <w:ilvl w:val="2"/>
+          <w:numId w:val="1"/>
+        </w:numPr>
+        <w:ind w:left="2160" w:hanging="360"/>
+        <w:rPr>
+          <w:sz w:val="24"/>
+          <w:szCs w:val="24"/>
+        </w:rPr>
+      </w:pPr>
+      <w:r>
+        <w:rPr>
+          <w:b/>
+        </w:rPr>
+        <w:t xml:space="preserve">Decisión: </w:t>
+      </w:r>
+      <w:r>
+        <w:rPr>
+          <w:b w:val="0"/>
+        </w:rPr>
+        <w:t>solo corregir el registro.</w:t>
+      </w:r>
+    </w:p>
+    <w:p>
+      <w:pPr>
+        <w:numPr>
+          <w:ilvl w:val="2"/>
+          <w:numId w:val="1"/>
+        </w:numPr>
+        <w:ind w:left="2160" w:hanging="360"/>
+        <w:rPr>
+          <w:sz w:val="24"/>
+          <w:szCs w:val="24"/>
+        </w:rPr>
+      </w:pPr>
+      <w:r>
+        <w:rPr>
+          <w:b/>
+        </w:rPr>
+        <w:t xml:space="preserve">Hallazgos verificados: </w:t>
+      </w:r>
+      <w:r>
+        <w:rPr>
+          <w:b w:val="0"/>
+        </w:rPr>
+        <w:t>nvarchar ya no aparece en SOPORTE ni CONTACTO. Faltan notas de responsabilidad. Hay varchar (50) en minúsculas y con espacio (SOPORTE J7; CONTACTO F7, J7). SOPORTE.estado_ticket_ID (A11) no existe en init.sql.</w:t>
+      </w:r>
+    </w:p>
+    <w:p>
+      <w:pPr>
+        <w:numPr>
+          <w:ilvl w:val="2"/>
+          <w:numId w:val="1"/>
+        </w:numPr>
+        <w:ind w:left="2160" w:hanging="360"/>
+        <w:rPr>
+          <w:sz w:val="24"/>
+          <w:szCs w:val="24"/>
+        </w:rPr>
+      </w:pPr>
+      <w:r>
+        <w:rPr>
+          <w:b/>
+        </w:rPr>
+        <w:t xml:space="preserve">Archivos modificados: </w:t>
+      </w:r>
+      <w:r>
+        <w:rPr>
+          <w:b w:val="0"/>
+        </w:rPr>
+        <w:t>datos_agrupados_trazable.docx: registro de ERR-08.21 de "documentada" a "parcial". Matriz (fila 131: estado Parcial, evidencia y nota).</w:t>
+      </w:r>
+    </w:p>
+    <w:p>
+      <w:pPr>
+        <w:numPr>
+          <w:ilvl w:val="2"/>
+          <w:numId w:val="1"/>
+        </w:numPr>
+        <w:ind w:left="2160" w:hanging="360"/>
+        <w:rPr>
+          <w:sz w:val="24"/>
+          <w:szCs w:val="24"/>
+        </w:rPr>
+      </w:pPr>
+      <w:r>
+        <w:rPr>
+          <w:b/>
+        </w:rPr>
+        <w:t xml:space="preserve">Estado final: </w:t>
+      </w:r>
+      <w:r>
+        <w:rPr>
+          <w:b w:val="0"/>
+        </w:rPr>
+        <w:t>ERR-08.21: PARCIAL.</w:t>
+      </w:r>
+    </w:p>
+    <w:p>
+      <w:pPr>
+        <w:rPr>
+          <w:sz w:val="24"/>
+          <w:szCs w:val="24"/>
+        </w:rPr>
+      </w:pPr>
+      <w:r>
+        <w:rPr>
+          <w:b/>
+        </w:rPr>
+        <w:t>Intervención ERR-08.23, categoría I (18/10/2026): hoja fuera de alcance identificada como anexo</w:t>
+      </w:r>
+    </w:p>
+    <w:p>
+      <w:pPr>
+        <w:numPr>
+          <w:ilvl w:val="2"/>
+          <w:numId w:val="1"/>
+        </w:numPr>
+        <w:ind w:left="2160" w:hanging="360"/>
+        <w:rPr>
+          <w:sz w:val="24"/>
+          <w:szCs w:val="24"/>
+        </w:rPr>
+      </w:pPr>
+      <w:r>
+        <w:rPr>
+          <w:b/>
+        </w:rPr>
+        <w:t xml:space="preserve">Identificadores: </w:t>
+      </w:r>
+      <w:r>
+        <w:rPr>
+          <w:b w:val="0"/>
+        </w:rPr>
+        <w:t>ERR-08.23. Categoría: ERR-08, Otros (I), por ser de alcance del modelo.</w:t>
+      </w:r>
+    </w:p>
+    <w:p>
+      <w:pPr>
+        <w:numPr>
+          <w:ilvl w:val="2"/>
+          <w:numId w:val="1"/>
+        </w:numPr>
+        <w:ind w:left="2160" w:hanging="360"/>
+        <w:rPr>
+          <w:sz w:val="24"/>
+          <w:szCs w:val="24"/>
+        </w:rPr>
+      </w:pPr>
+      <w:r>
+        <w:rPr>
+          <w:b/>
+        </w:rPr>
+        <w:t xml:space="preserve">Problema original: </w:t>
+      </w:r>
+      <w:r>
+        <w:rPr>
+          <w:b w:val="0"/>
+        </w:rPr>
+        <w:t>la hoja PROPUESTA DE MEJORA, con 13 tablas fuera de alcance, estaba mezclada con el modelo (AUDIT-197).</w:t>
+      </w:r>
+    </w:p>
+    <w:p>
+      <w:pPr>
+        <w:numPr>
+          <w:ilvl w:val="2"/>
+          <w:numId w:val="1"/>
+        </w:numPr>
+        <w:ind w:left="2160" w:hanging="360"/>
+        <w:rPr>
+          <w:sz w:val="24"/>
+          <w:szCs w:val="24"/>
+        </w:rPr>
+      </w:pPr>
+      <w:r>
+        <w:rPr>
+          <w:b/>
+        </w:rPr>
+        <w:t xml:space="preserve">Archivos modificados: </w:t>
+      </w:r>
+      <w:r>
+        <w:rPr>
+          <w:b w:val="0"/>
+        </w:rPr>
+        <w:t>4.1 BDD con tipos de datos.xlsx: nombre de la hoja PROPUESTA DE MEJORA a ANEXO FUERA DE ALCANCE. Contenido sin cambios. Matriz (fila 133). datos_agrupados_trazable.docx: resaltado verde y trazabilidad de ERR-08.23.</w:t>
+      </w:r>
+    </w:p>
+    <w:p>
+      <w:pPr>
+        <w:numPr>
+          <w:ilvl w:val="2"/>
+          <w:numId w:val="1"/>
+        </w:numPr>
+        <w:ind w:left="2160" w:hanging="360"/>
+        <w:rPr>
+          <w:sz w:val="24"/>
+          <w:szCs w:val="24"/>
+        </w:rPr>
+      </w:pPr>
+      <w:r>
+        <w:rPr>
+          <w:b/>
+        </w:rPr>
+        <w:t xml:space="preserve">Solución implementada: </w:t>
+      </w:r>
+      <w:r>
+        <w:rPr>
+          <w:b w:val="0"/>
+        </w:rPr>
+        <w:t>renombrado de la hoja. No se eliminó contenido; eliminarla requeriría autorización.</w:t>
+      </w:r>
+    </w:p>
+    <w:p>
+      <w:pPr>
+        <w:numPr>
+          <w:ilvl w:val="2"/>
+          <w:numId w:val="1"/>
+        </w:numPr>
+        <w:ind w:left="2160" w:hanging="360"/>
+        <w:rPr>
+          <w:sz w:val="24"/>
+          <w:szCs w:val="24"/>
+        </w:rPr>
+      </w:pPr>
+      <w:r>
+        <w:rPr>
+          <w:b/>
+        </w:rPr>
+        <w:t xml:space="preserve">Resultado de las pruebas: </w:t>
+      </w:r>
+      <w:r>
+        <w:rPr>
+          <w:b w:val="0"/>
+        </w:rPr>
+        <w:t>comparación celda a celda del contenido antes y después del renombrado: idéntico. Ninguna fórmula ni validación referencia el nombre anterior.</w:t>
+      </w:r>
+    </w:p>
+    <w:p>
+      <w:pPr>
+        <w:numPr>
+          <w:ilvl w:val="2"/>
+          <w:numId w:val="1"/>
+        </w:numPr>
+        <w:ind w:left="2160" w:hanging="360"/>
+        <w:rPr>
+          <w:sz w:val="24"/>
+          <w:szCs w:val="24"/>
+        </w:rPr>
+      </w:pPr>
+      <w:r>
+        <w:rPr>
+          <w:b/>
+        </w:rPr>
+        <w:t xml:space="preserve">Estado final: </w:t>
+      </w:r>
+      <w:r>
+        <w:rPr>
+          <w:b w:val="0"/>
+        </w:rPr>
+        <w:t>ERR-08.23: RESUELTO.</w:t>
+      </w:r>
+    </w:p>
+    <w:p>
+      <w:pPr>
+        <w:numPr>
+          <w:ilvl w:val="2"/>
+          <w:numId w:val="1"/>
+        </w:numPr>
+        <w:ind w:left="2160" w:hanging="360"/>
+        <w:rPr>
+          <w:sz w:val="24"/>
+          <w:szCs w:val="24"/>
+        </w:rPr>
+      </w:pPr>
+      <w:r>
+        <w:rPr>
+          <w:b/>
+        </w:rPr>
+        <w:t xml:space="preserve">Observaciones: </w:t>
+      </w:r>
+      <w:r>
+        <w:rPr>
+          <w:b w:val="0"/>
+        </w:rPr>
+        <w:t>el registro anterior citaba "ANEXO FUERA DE ALCANCE" como nombre existente; ahora coincide. El contenido de la hoja incluye los tipos convertidos en ERR-08.06.</w:t>
+      </w:r>
+    </w:p>
+    <w:p>
+      <w:pPr>
+        <w:rPr>
+          <w:sz w:val="24"/>
+          <w:szCs w:val="24"/>
+        </w:rPr>
+      </w:pPr>
+      <w:r>
+        <w:rPr>
+          <w:b/>
+        </w:rPr>
+        <w:t>Intervención ERR-08.24, categoría I (18/10/2026): precisión del conteo de tablas en la especificación 4.2</w:t>
+      </w:r>
+    </w:p>
+    <w:p>
+      <w:pPr>
+        <w:numPr>
+          <w:ilvl w:val="2"/>
+          <w:numId w:val="1"/>
+        </w:numPr>
+        <w:ind w:left="2160" w:hanging="360"/>
+        <w:rPr>
+          <w:sz w:val="24"/>
+          <w:szCs w:val="24"/>
+        </w:rPr>
+      </w:pPr>
+      <w:r>
+        <w:rPr>
+          <w:b/>
+        </w:rPr>
+        <w:t xml:space="preserve">Identificadores: </w:t>
+      </w:r>
+      <w:r>
+        <w:rPr>
+          <w:b w:val="0"/>
+        </w:rPr>
+        <w:t>ERR-08.24. Categoría: ERR-08, Otros (I): documentación de la capa de datos.</w:t>
+      </w:r>
+    </w:p>
+    <w:p>
+      <w:pPr>
+        <w:numPr>
+          <w:ilvl w:val="2"/>
+          <w:numId w:val="1"/>
+        </w:numPr>
+        <w:ind w:left="2160" w:hanging="360"/>
+        <w:rPr>
+          <w:sz w:val="24"/>
+          <w:szCs w:val="24"/>
+        </w:rPr>
+      </w:pPr>
+      <w:r>
+        <w:rPr>
+          <w:b/>
+        </w:rPr>
+        <w:t xml:space="preserve">Problema original: </w:t>
+      </w:r>
+      <w:r>
+        <w:rPr>
+          <w:b w:val="0"/>
+        </w:rPr>
+        <w:t>4.2 fijaba "las 30 tablas normalizadas" sin mencionar init.sql ni el ORM (AUDIT-202).</w:t>
+      </w:r>
+    </w:p>
+    <w:p>
+      <w:pPr>
+        <w:numPr>
+          <w:ilvl w:val="2"/>
+          <w:numId w:val="1"/>
+        </w:numPr>
+        <w:ind w:left="2160" w:hanging="360"/>
+        <w:rPr>
+          <w:sz w:val="24"/>
+          <w:szCs w:val="24"/>
+        </w:rPr>
+      </w:pPr>
+      <w:r>
+        <w:rPr>
+          <w:b/>
+        </w:rPr>
+        <w:t xml:space="preserve">Archivos modificados: </w:t>
+      </w:r>
+      <w:r>
+        <w:rPr>
+          <w:b w:val="0"/>
+        </w:rPr>
+        <w:t>4.2 Especificación de Herramientas y Servicios del Proyecto.docx: frase de PostgreSQL (se cita init.sql, 30 tablas y la migración pendiente). Matriz (fila 134). datos_agrupados_trazable.docx: resaltado verde y trazabilidad de ERR-08.24.</w:t>
+      </w:r>
+    </w:p>
+    <w:p>
+      <w:pPr>
+        <w:numPr>
+          <w:ilvl w:val="2"/>
+          <w:numId w:val="1"/>
+        </w:numPr>
+        <w:ind w:left="2160" w:hanging="360"/>
+        <w:rPr>
+          <w:sz w:val="24"/>
+          <w:szCs w:val="24"/>
+        </w:rPr>
+      </w:pPr>
+      <w:r>
+        <w:rPr>
+          <w:b/>
+        </w:rPr>
+        <w:t xml:space="preserve">Solución implementada: </w:t>
+      </w:r>
+      <w:r>
+        <w:rPr>
+          <w:b w:val="0"/>
+        </w:rPr>
+        <w:t>precisión del texto. El número 30 se mantiene porque coincide con los CREATE TABLE de init.sql.</w:t>
+      </w:r>
+    </w:p>
+    <w:p>
+      <w:pPr>
+        <w:numPr>
+          <w:ilvl w:val="2"/>
+          <w:numId w:val="1"/>
+        </w:numPr>
+        <w:ind w:left="2160" w:hanging="360"/>
+        <w:rPr>
+          <w:sz w:val="24"/>
+          <w:szCs w:val="24"/>
+        </w:rPr>
+      </w:pPr>
+      <w:r>
+        <w:rPr>
+          <w:b/>
+        </w:rPr>
+        <w:t xml:space="preserve">Resultado de las pruebas: </w:t>
+      </w:r>
+      <w:r>
+        <w:rPr>
+          <w:b w:val="0"/>
+        </w:rPr>
+        <w:t>conteo de CREATE TABLE en init.sql: 30. Verificación del texto del documento tras guardarlo.</w:t>
+      </w:r>
+    </w:p>
+    <w:p>
+      <w:pPr>
+        <w:numPr>
+          <w:ilvl w:val="2"/>
+          <w:numId w:val="1"/>
+        </w:numPr>
+        <w:ind w:left="2160" w:hanging="360"/>
+        <w:rPr>
+          <w:sz w:val="24"/>
+          <w:szCs w:val="24"/>
+        </w:rPr>
+      </w:pPr>
+      <w:r>
+        <w:rPr>
+          <w:b/>
+        </w:rPr>
+        <w:t xml:space="preserve">Estado final: </w:t>
+      </w:r>
+      <w:r>
+        <w:rPr>
+          <w:b w:val="0"/>
+        </w:rPr>
+        <w:t>ERR-08.24: RESUELTO.</w:t>
+      </w:r>
+    </w:p>
+    <w:p>
+      <w:pPr>
+        <w:numPr>
+          <w:ilvl w:val="2"/>
+          <w:numId w:val="1"/>
+        </w:numPr>
+        <w:ind w:left="2160" w:hanging="360"/>
+        <w:rPr>
+          <w:sz w:val="24"/>
+          <w:szCs w:val="24"/>
+        </w:rPr>
+      </w:pPr>
+      <w:r>
+        <w:rPr>
+          <w:b/>
+        </w:rPr>
+        <w:t xml:space="preserve">Observaciones: </w:t>
+      </w:r>
+      <w:r>
+        <w:rPr>
+          <w:b w:val="0"/>
+        </w:rPr>
+        <w:t>el diccionario y Cambios Pendientes añaden tablas (ANTECEDENTE_MEDICO, ENVIO_ALERTA, ENLACE_MEDICO). Esas tablas quedan para la migración (ERR-08.25).</w:t>
+      </w:r>
+    </w:p>
+    <w:p>
+      <w:pPr>
+        <w:rPr>
+          <w:sz w:val="24"/>
+          <w:szCs w:val="24"/>
+        </w:rPr>
+      </w:pPr>
+      <w:r>
+        <w:rPr>
+          <w:b/>
+        </w:rPr>
+        <w:t>Revisión ERR-08.25, categoría E (18/10/2026): pendiente (sin cambios en archivos)</w:t>
+      </w:r>
+    </w:p>
+    <w:p>
+      <w:pPr>
+        <w:numPr>
+          <w:ilvl w:val="2"/>
+          <w:numId w:val="1"/>
+        </w:numPr>
+        <w:ind w:left="2160" w:hanging="360"/>
+        <w:rPr>
+          <w:sz w:val="24"/>
+          <w:szCs w:val="24"/>
+        </w:rPr>
+      </w:pPr>
+      <w:r>
+        <w:rPr>
+          <w:b/>
+        </w:rPr>
+        <w:t xml:space="preserve">Identificadores: </w:t>
+      </w:r>
+      <w:r>
+        <w:rPr>
+          <w:b w:val="0"/>
+        </w:rPr>
+        <w:t>ERR-08.25 (AUDIT-P02). Categoría: ERR-08, Migraciones y sincronización (E).</w:t>
+      </w:r>
+    </w:p>
+    <w:p>
+      <w:pPr>
+        <w:numPr>
+          <w:ilvl w:val="2"/>
+          <w:numId w:val="1"/>
+        </w:numPr>
+        <w:ind w:left="2160" w:hanging="360"/>
+        <w:rPr>
+          <w:sz w:val="24"/>
+          <w:szCs w:val="24"/>
+        </w:rPr>
+      </w:pPr>
+      <w:r>
+        <w:rPr>
+          <w:b/>
+        </w:rPr>
+        <w:t xml:space="preserve">Decisión: </w:t>
+      </w:r>
+      <w:r>
+        <w:rPr>
+          <w:b w:val="0"/>
+        </w:rPr>
+        <w:t>solo registrar pendiente. No se modificó init.sql ni el código.</w:t>
+      </w:r>
+    </w:p>
+    <w:p>
+      <w:pPr>
+        <w:numPr>
+          <w:ilvl w:val="2"/>
+          <w:numId w:val="1"/>
+        </w:numPr>
+        <w:ind w:left="2160" w:hanging="360"/>
+        <w:rPr>
+          <w:sz w:val="24"/>
+          <w:szCs w:val="24"/>
+        </w:rPr>
+      </w:pPr>
+      <w:r>
+        <w:rPr>
+          <w:b/>
+        </w:rPr>
+        <w:t xml:space="preserve">Dependencias: </w:t>
+      </w:r>
+      <w:r>
+        <w:rPr>
+          <w:b w:val="0"/>
+        </w:rPr>
+        <w:t>ERR-08.11 (pin_hash), 08.12 (init.sql), 08.13 a 08.17 (alertas, ENVIO_ALERTA) dependen de esta migración.</w:t>
+      </w:r>
+    </w:p>
+    <w:p>
+      <w:pPr>
+        <w:numPr>
+          <w:ilvl w:val="2"/>
+          <w:numId w:val="1"/>
+        </w:numPr>
+        <w:ind w:left="2160" w:hanging="360"/>
+        <w:rPr>
+          <w:sz w:val="24"/>
+          <w:szCs w:val="24"/>
+        </w:rPr>
+      </w:pPr>
+      <w:r>
+        <w:rPr>
+          <w:b/>
+        </w:rPr>
+        <w:t xml:space="preserve">Estado final: </w:t>
+      </w:r>
+      <w:r>
+        <w:rPr>
+          <w:b w:val="0"/>
+        </w:rPr>
+        <w:t>ERR-08.25: PENDIENTE.</w:t>
       </w:r>
     </w:p>
     <w:sectPr>

</xml_diff>